<commit_message>
Capitoli 7 e 8 senza pagine con poche righe in coda
- cap. 7: 7.3 e 7.4 accorciati, didascalie su una riga, figura 7.1 al 90 %
- cap. 8: tagliate ripetizioni nei paragrafi di apertura e tolto il titolo
  "Sviluppi futuri", gia' nel titolo del capitolo
- bozze Word allineate

Co-Authored-By: Claude Opus 5.5 <noreply@anthropic.com>
</commit_message>
<xml_diff>
--- a/bozza_capitolo7.docx
+++ b/bozza_capitolo7.docx
@@ -934,7 +934,7 @@
         <w:rPr>
           <w:lang w:val="it-IT"/>
         </w:rPr>
-        <w:t>Con una cella litio-ione 18650 da 3000 mAh e un rendimento del regolatore dell'85 % restano circa 2550 mAh utili, che divisi per la corrente media danno le autonomie della Tabella 7.3. La Figura 7.1 le riassume insieme ai consumi dei componenti. Per il nodo in deep-sleep conta anche l'autoscarica della cella, che però non è inclusa nel calcolo.</w:t>
+        <w:t>Una cella litio-ione 18650 da 3000 mAh, con un regolatore all'85 % di rendimento, fornisce circa 2550 mAh utili, che divisi per la corrente media danno le autonomie della Tabella 7.3 e della Figura 7.1. Il calcolo non include l'autoscarica della cella.</w:t>
       </w:r>
       <w:r>
         <w:rPr>
@@ -961,7 +961,7 @@
           <w:sz w:val="20"/>
           <w:lang w:val="it-IT"/>
         </w:rPr>
-        <w:t>Tabella 7.3: Autonomia stimata con una cella 18650 da 3000 mAh, per correnti medie tipiche dentro gli intervalli della Tabella 7.2.</w:t>
+        <w:t>Tabella 7.3: Autonomia stimata con una cella 18650 da 3000 mAh.</w:t>
       </w:r>
     </w:p>
     <w:tbl>
@@ -1381,7 +1381,7 @@
           <w:sz w:val="20"/>
           <w:lang w:val="it-IT"/>
         </w:rPr>
-        <w:t>Figura 7.1: Consumi da datasheet dei singoli componenti e autonomia stimata dei nodi completi, in scala logaritmica.</w:t>
+        <w:t>Figura 7.1: Consumi dei componenti e autonomia dei nodi, in scala logaritmica.</w:t>
       </w:r>
     </w:p>
     <w:p>
@@ -1409,7 +1409,7 @@
         <w:rPr>
           <w:lang w:val="it-IT"/>
         </w:rPr>
-        <w:t>I numeri di questo capitolo fissano i vincoli per il nodo del progetto. Con il radar sempre acceso la batteria dura meno di un giorno (Tabella 7.3). Un nodo in deep-sleep svegliato dal PIR arriva invece a 4,9 anni, un limite superiore, perché durante le lezioni il PIR sveglia il nodo di continuo. Una via intermedia è accendere il radar un minuto ogni cinque, con l'ESP32 in light-sleep negli altri quattro. La corrente media scende a circa 27 mA e l'autonomia supera i tre giorni, al prezzo di una latenza di rilevamento fino a quattro minuti. Su questi valori si basa l'architettura proposta nelle conclusioni (Capitolo 8), in cui il PIR decide quando accendere il radar.</w:t>
+        <w:t>Con il radar sempre acceso la batteria dura meno di un giorno (Tabella 7.3), mentre un nodo in deep-sleep svegliato dal PIR arriva a 4,9 anni, un limite superiore perché durante le lezioni il PIR lo sveglia di continuo. Accendendo il radar un minuto ogni cinque, con l'ESP32 in light-sleep negli altri quattro, la corrente media scende a circa 27 mA e l'autonomia supera i tre giorni, con una latenza fino a quattro minuti. Su questi valori si basa l'architettura delle conclusioni (Capitolo 8), in cui il PIR decide quando accendere il radar.</w:t>
       </w:r>
     </w:p>
     <w:sectPr>

</xml_diff>